<commit_message>
Add raw T-100 files (zipped) and updated report
</commit_message>
<xml_diff>
--- a/report/QM640_Interim_Report.docx
+++ b/report/QM640_Interim_Report.docx
@@ -14243,7 +14243,7 @@
           <w:sz w:val="24"/>
           <w:szCs w:val="24"/>
         </w:rPr>
-        <w:t xml:space="preserve">data/raw/otp and data/raw/t100_segment (not committed because a full year of flight-level data is far larger than GitHub allows; the exact download links and field lists are in data/README.md and scripts/download_bts_otp.py). A random sample of 100,000 raw On-Time records is committed in data/raw_sample.</w:t>
+        <w:t xml:space="preserve">data/raw/otp and data/raw/t100_segment (the monthly On-Time zip files as downloaded and the yearly T-100 files compressed to zip; the download links and field lists are in data/README.md and scripts/download_bts_otp.py). A random sample of 100,000 raw On-Time records is committed in data/raw_sample.</w:t>
       </w:r>
     </w:p>
     <w:p>
@@ -14443,7 +14443,7 @@
           <w:sz w:val="22"/>
           <w:szCs w:val="22"/>
         </w:rPr>
-        <w:t xml:space="preserve">The raw monthly files are listed in the structure but excluded from version control by .gitignore.</w:t>
+        <w:t xml:space="preserve">The raw monthly files are committed as zip files. Only the large cleaned parquet file is left out, and notebook 01 rebuilds it.</w:t>
       </w:r>
     </w:p>
     <w:p>

</xml_diff>